<commit_message>
New translations module 6 - closing session.docx (Papiamento)
</commit_message>
<xml_diff>
--- a/translations/plh_facilitator_cw/pap/pap_Module 6 - Closing Session.docx
+++ b/translations/plh_facilitator_cw/pap/pap_Module 6 - Closing Session.docx
@@ -187,7 +187,7 @@
         <w:spacing w:after="200" w:line="360" w:lineRule="auto"/>
       </w:pPr>
       <w:r>
-        <w:t xml:space="preserve">Bo por duna ehèmpel di esaki: “Mi ta sintí mi ansioso. Mi ta sintié den mi skoudernan. Mi ta preokupá si mi tin sufisiente sèn e luna akí pa kuminda,” òf “Mi ta sintí mi orguyoso. Mi ta sintié den mi pechu. Mi a kasi kompletá e programa di Mayor Konektá!” </w:t>
+        <w:t xml:space="preserve">Bo por duna ehèmpel di esaki: “Mi ta sintí mi ansioso. Mi ta sintié den mi skoudernan. Mi ta preokupá si mi tin sufisiente sèn e luna akí pa kumpra kuminda,” òf “Mi ta sintí mi orguyoso. Mi ta sintié den mi pechu. Mi a kasi kompletá e programa di Mayor Konektá!” </w:t>
       </w:r>
     </w:p>
     <w:p>
@@ -276,7 +276,7 @@
         <w:spacing w:after="200" w:line="360" w:lineRule="auto"/>
       </w:pPr>
       <w:r>
-        <w:t xml:space="preserve">Laga e partisipantenan visualisá henter e programa dor di hala nan atenshon na momentunan importante, Tepnan di Mayor, Komponentenan Básiko i eksperensianan ku por a surgi:</w:t>
+        <w:t xml:space="preserve">Laga e partisipantenan visualisá henter e programa dor di hala nan atenshon na momentunan importante, Tepnan di Edukashon Familiar, Komponentenan Básiko i eksperensianan ku por a surgi:</w:t>
       </w:r>
     </w:p>
     <w:p>
@@ -352,7 +352,7 @@
         <w:ind w:left="1434" w:hanging="357"/>
       </w:pPr>
       <w:r>
-        <w:t xml:space="preserve">Pasa Tempu Abo ku bo Yu</w:t>
+        <w:t xml:space="preserve">Tempu-pa Abo-ku Bo yu</w:t>
       </w:r>
     </w:p>
     <w:p>
@@ -696,7 +696,7 @@
         <w:t xml:space="preserve">Tene na kuenta: </w:t>
       </w:r>
       <w:r>
-        <w:t xml:space="preserve">Pèrmití kada partisipante pa kompartí pero purba di tene e kompartimentu kòrtiku (1-2 minüt kada un). Abo tambe por traha un pintura i kompartí esaki!</w:t>
+        <w:t xml:space="preserve">Pèrmití kada partisipante pa kompartí pero purba di tene e momentu aki kòrtiku (1-2 minüt kada un). Abo tambe por traha un pintura i kompartí esaki!</w:t>
       </w:r>
     </w:p>
     <w:p>
@@ -2126,7 +2126,7 @@
       <w:bookmarkStart w:colFirst="0" w:colLast="0" w:name="_15phjt5" w:id="23"/>
       <w:bookmarkEnd w:id="23"/>
       <w:r>
-        <w:t xml:space="preserve">TAREANAN DI KAS KONTINUO </w:t>
+        <w:t xml:space="preserve">TAREANAN PA HASI NA KAS KONTINUO </w:t>
       </w:r>
     </w:p>
     <w:p>
@@ -2158,7 +2158,7 @@
         <w:spacing w:after="200" w:line="360" w:lineRule="auto"/>
       </w:pPr>
       <w:r>
-        <w:t xml:space="preserve">E tareanan di kas ta un manera ekselente pa mayornan keda konektá ku e programa dor di partisipá aktivamente den desaroyá relashonnan positivo.</w:t>
+        <w:t xml:space="preserve">E tareanan pa hasi na kas ta un manera ekselente pa mayornan keda konektá ku e programa dor di partisipá aktivamente den desaroyá relashonnan positivo.</w:t>
       </w:r>
     </w:p>
     <w:p>
@@ -2167,7 +2167,7 @@
         <w:spacing w:after="200" w:line="360" w:lineRule="auto"/>
       </w:pPr>
       <w:r>
-        <w:t xml:space="preserve">Mester enkurashá famianan pa rekompensá nan mes semper ku nan hasi un tarea di kas!</w:t>
+        <w:t xml:space="preserve">Mester enkurashá famianan pa rekompensá nan mes semper ku nan hasi e tarea pa hasi na kas!</w:t>
       </w:r>
     </w:p>
     <w:p>
@@ -2644,7 +2644,7 @@
         <w:spacing w:after="120" w:line="360" w:lineRule="auto"/>
       </w:pPr>
       <w:r>
-        <w:t xml:space="preserve">Reparti sertifikado di finalisashon na mayornan na final di e seshon. Esaki ta un simpel rekonosimentu pa nan logro di a finalisá e programa.</w:t>
+        <w:t xml:space="preserve">Reparti sertifikado di partisipashon na mayornan/edukadónan na final di e seshon. Esaki ta un simpel rekonosimentu pa nan logro di a finalisá e programa.</w:t>
       </w:r>
     </w:p>
     <w:p>
@@ -2690,7 +2690,7 @@
       <w:bookmarkStart w:colFirst="0" w:colLast="0" w:name="_1j4nfs6" w:id="28"/>
       <w:bookmarkEnd w:id="28"/>
       <w:r>
-        <w:t xml:space="preserve">CHÈK EMOSHONAL NA FINAL</w:t>
+        <w:t xml:space="preserve">CHEK EMOSHONAL NA FINAL</w:t>
       </w:r>
     </w:p>
     <w:p>

</xml_diff>